<commit_message>
scribe/gp-reassessment: full cover letter on its own page
The GP report now opens with a proper transmittal cover letter (page 1), then
the reassessment report on page 2.

- Template restructured: page 1 = letterhead, date, recipient block, Dear Dr,
  RE: line, cover-letter body, and sign-off; page break; page 2 = report title +
  Executive Summary / Objective Findings table / Clinical Interpretation /
  Recommendations.
- Editable "Cover Letter" field in the GP preview, pre-filled with a sensible
  default (patient name + visit/baseline dates); server renderer has the same
  fallback if none is supplied.

Co-Authored-By: Claude Opus 4.8 <noreply@anthropic.com>
</commit_message>
<xml_diff>
--- a/backend/assets/GP_Reassessment_Template.docx
+++ b/backend/assets/GP_Reassessment_Template.docx
@@ -170,7 +170,7 @@
     </w:tbl>
     <w:p>
       <w:pPr>
-        <w:spacing w:after="200" w:before="120"/>
+        <w:spacing w:after="240" w:before="120"/>
         <w:jc w:val="right"/>
       </w:pPr>
       <w:r>
@@ -215,7 +215,7 @@
     </w:p>
     <w:p>
       <w:pPr>
-        <w:spacing w:after="200"/>
+        <w:spacing w:after="260"/>
       </w:pPr>
       <w:r>
         <w:rPr>
@@ -229,7 +229,7 @@
     </w:p>
     <w:p>
       <w:pPr>
-        <w:spacing w:after="160"/>
+        <w:spacing w:after="200"/>
       </w:pPr>
       <w:r>
         <w:rPr>
@@ -246,7 +246,7 @@
         <w:pBdr>
           <w:bottom w:val="single" w:color="46C1C0" w:sz="12"/>
         </w:pBdr>
-        <w:spacing w:after="240"/>
+        <w:spacing w:after="280"/>
       </w:pPr>
       <w:r>
         <w:rPr>
@@ -293,7 +293,57 @@
     </w:p>
     <w:p>
       <w:pPr>
-        <w:spacing w:after="200"/>
+        <w:keepLines/>
+        <w:spacing w:after="200" w:line="300"/>
+      </w:pPr>
+      <w:r>
+        <w:rPr>
+          <w:rFonts w:ascii="Manrope" w:cs="Manrope" w:eastAsia="Manrope" w:hAnsi="Manrope"/>
+          <w:color w:val="1A2230"/>
+          <w:sz w:val="22"/>
+          <w:szCs w:val="22"/>
+        </w:rPr>
+        <w:t xml:space="preserve">{{cover_letter}}</w:t>
+      </w:r>
+    </w:p>
+    <w:p>
+      <w:pPr>
+        <w:spacing w:after="40" w:before="280"/>
+      </w:pPr>
+      <w:r>
+        <w:rPr>
+          <w:rFonts w:ascii="Manrope" w:cs="Manrope" w:eastAsia="Manrope" w:hAnsi="Manrope"/>
+          <w:color w:val="1A2230"/>
+          <w:sz w:val="22"/>
+          <w:szCs w:val="22"/>
+        </w:rPr>
+        <w:t xml:space="preserve">Kind regards,</w:t>
+      </w:r>
+    </w:p>
+    <w:p>
+      <w:pPr>
+        <w:spacing w:after="120"/>
+      </w:pPr>
+    </w:p>
+    <w:p>
+      <w:pPr>
+        <w:spacing w:after="10"/>
+      </w:pPr>
+      <w:r>
+        <w:rPr>
+          <w:rFonts w:ascii="Manrope" w:cs="Manrope" w:eastAsia="Manrope" w:hAnsi="Manrope"/>
+          <w:b/>
+          <w:bCs/>
+          <w:color w:val="132232"/>
+          <w:sz w:val="24"/>
+          <w:szCs w:val="24"/>
+        </w:rPr>
+        <w:t xml:space="preserve">Ryan Heath</w:t>
+      </w:r>
+    </w:p>
+    <w:p>
+      <w:pPr>
+        <w:spacing w:after="4"/>
       </w:pPr>
       <w:r>
         <w:rPr>
@@ -302,8 +352,10 @@
           <w:sz w:val="20"/>
           <w:szCs w:val="20"/>
         </w:rPr>
-        <w:t xml:space="preserve">Baseline </w:t>
-      </w:r>
+        <w:t xml:space="preserve">BClinExPhys (Hons)  ·  Accredited Exercise Physiologist</w:t>
+      </w:r>
+    </w:p>
+    <w:p>
       <w:r>
         <w:rPr>
           <w:rFonts w:ascii="Manrope" w:cs="Manrope" w:eastAsia="Manrope" w:hAnsi="Manrope"/>
@@ -313,7 +365,7 @@
           <w:sz w:val="20"/>
           <w:szCs w:val="20"/>
         </w:rPr>
-        <w:t xml:space="preserve">{{baseline_date}}</w:t>
+        <w:t xml:space="preserve">Moveify Health Solutions</w:t>
       </w:r>
       <w:r>
         <w:rPr>
@@ -324,7 +376,342 @@
           <w:sz w:val="20"/>
           <w:szCs w:val="20"/>
         </w:rPr>
-        <w:t xml:space="preserve">   →   </w:t>
+        <w:t xml:space="preserve">  ·  </w:t>
+      </w:r>
+      <w:r>
+        <w:rPr>
+          <w:rFonts w:ascii="Manrope" w:cs="Manrope" w:eastAsia="Manrope" w:hAnsi="Manrope"/>
+          <w:color w:val="56606E"/>
+          <w:sz w:val="20"/>
+          <w:szCs w:val="20"/>
+        </w:rPr>
+        <w:t xml:space="preserve">0435 524 991</w:t>
+      </w:r>
+      <w:r>
+        <w:rPr>
+          <w:rFonts w:ascii="Manrope" w:cs="Manrope" w:eastAsia="Manrope" w:hAnsi="Manrope"/>
+          <w:b/>
+          <w:bCs/>
+          <w:color w:val="46C1C0"/>
+          <w:sz w:val="20"/>
+          <w:szCs w:val="20"/>
+        </w:rPr>
+        <w:t xml:space="preserve">  ·  </w:t>
+      </w:r>
+      <w:r>
+        <w:rPr>
+          <w:rFonts w:ascii="Manrope" w:cs="Manrope" w:eastAsia="Manrope" w:hAnsi="Manrope"/>
+          <w:color w:val="56606E"/>
+          <w:sz w:val="20"/>
+          <w:szCs w:val="20"/>
+        </w:rPr>
+        <w:t xml:space="preserve">ryan@moveifyhealth.com</w:t>
+      </w:r>
+    </w:p>
+    <w:p>
+      <w:pPr>
+        <w:pBdr>
+          <w:top w:val="single" w:color="E2E8F0" w:sz="4"/>
+        </w:pBdr>
+        <w:spacing w:before="280"/>
+        <w:jc w:val="center"/>
+      </w:pPr>
+      <w:r>
+        <w:rPr>
+          <w:rFonts w:ascii="Manrope" w:cs="Manrope" w:eastAsia="Manrope" w:hAnsi="Manrope"/>
+          <w:color w:val="94A3B8"/>
+          <w:sz w:val="15"/>
+          <w:szCs w:val="15"/>
+        </w:rPr>
+        <w:t xml:space="preserve">Moveify Health Solutions</w:t>
+      </w:r>
+      <w:r>
+        <w:rPr>
+          <w:rFonts w:ascii="Manrope" w:cs="Manrope" w:eastAsia="Manrope" w:hAnsi="Manrope"/>
+          <w:b/>
+          <w:bCs/>
+          <w:color w:val="46C1C0"/>
+          <w:sz w:val="15"/>
+          <w:szCs w:val="15"/>
+        </w:rPr>
+        <w:t xml:space="preserve">  ·  </w:t>
+      </w:r>
+      <w:r>
+        <w:rPr>
+          <w:rFonts w:ascii="Manrope" w:cs="Manrope" w:eastAsia="Manrope" w:hAnsi="Manrope"/>
+          <w:color w:val="94A3B8"/>
+          <w:sz w:val="15"/>
+          <w:szCs w:val="15"/>
+        </w:rPr>
+        <w:t xml:space="preserve">ABN 52 263 141 529</w:t>
+      </w:r>
+      <w:r>
+        <w:rPr>
+          <w:rFonts w:ascii="Manrope" w:cs="Manrope" w:eastAsia="Manrope" w:hAnsi="Manrope"/>
+          <w:b/>
+          <w:bCs/>
+          <w:color w:val="46C1C0"/>
+          <w:sz w:val="15"/>
+          <w:szCs w:val="15"/>
+        </w:rPr>
+        <w:t xml:space="preserve">  ·  </w:t>
+      </w:r>
+      <w:r>
+        <w:rPr>
+          <w:rFonts w:ascii="Manrope" w:cs="Manrope" w:eastAsia="Manrope" w:hAnsi="Manrope"/>
+          <w:color w:val="94A3B8"/>
+          <w:sz w:val="15"/>
+          <w:szCs w:val="15"/>
+        </w:rPr>
+        <w:t xml:space="preserve">4 George St, Williamstown SA 5351</w:t>
+      </w:r>
+    </w:p>
+    <w:p>
+      <w:pPr>
+        <w:pageBreakBefore/>
+      </w:pPr>
+    </w:p>
+    <w:tbl>
+      <w:tblPr>
+        <w:tblW w:type="pct" w:w="100%"/>
+        <w:tblBorders>
+          <w:top w:val="none" w:color="FFFFFF" w:sz="0"/>
+          <w:left w:val="none" w:color="FFFFFF" w:sz="0"/>
+          <w:bottom w:val="single" w:color="E2E8F0" w:sz="4"/>
+          <w:right w:val="none" w:color="FFFFFF" w:sz="0"/>
+          <w:insideH w:val="none" w:color="FFFFFF" w:sz="0"/>
+          <w:insideV w:val="none" w:color="FFFFFF" w:sz="0"/>
+        </w:tblBorders>
+      </w:tblPr>
+      <w:tblGrid>
+        <w:gridCol w:w="100"/>
+        <w:gridCol w:w="100"/>
+      </w:tblGrid>
+      <w:tr>
+        <w:tc>
+          <w:tcPr>
+            <w:tcBorders>
+              <w:top w:val="none" w:color="FFFFFF" w:sz="0"/>
+              <w:left w:val="none" w:color="FFFFFF" w:sz="0"/>
+              <w:bottom w:val="none" w:color="FFFFFF" w:sz="0"/>
+              <w:right w:val="none" w:color="FFFFFF" w:sz="0"/>
+            </w:tcBorders>
+            <w:tcMar>
+              <w:top w:type="dxa" w:w="120"/>
+              <w:left w:type="dxa" w:w="0"/>
+              <w:bottom w:type="dxa" w:w="160"/>
+              <w:right w:type="dxa" w:w="0"/>
+            </w:tcMar>
+            <w:vAlign w:val="center"/>
+          </w:tcPr>
+          <w:p>
+            <w:r>
+              <w:drawing>
+                <wp:inline distT="0" distB="0" distL="0" distR="0">
+                  <wp:extent cx="847725" cy="476250"/>
+                  <wp:effectExtent t="0" r="0" b="0" l="0"/>
+                  <wp:docPr id="1" name="" descr="" title=""/>
+                  <wp:cNvGraphicFramePr>
+                    <a:graphicFrameLocks xmlns:a="http://schemas.openxmlformats.org/drawingml/2006/main" noChangeAspect="1"/>
+                  </wp:cNvGraphicFramePr>
+                  <a:graphic xmlns:a="http://schemas.openxmlformats.org/drawingml/2006/main">
+                    <a:graphicData uri="http://schemas.openxmlformats.org/drawingml/2006/picture">
+                      <pic:pic xmlns:pic="http://schemas.openxmlformats.org/drawingml/2006/picture">
+                        <pic:nvPicPr>
+                          <pic:cNvPr id="0" name="" descr=""/>
+                          <pic:cNvPicPr>
+                            <a:picLocks noChangeAspect="1" noChangeArrowheads="1"/>
+                          </pic:cNvPicPr>
+                        </pic:nvPicPr>
+                        <pic:blipFill>
+                          <a:blip r:embed="rId7" cstate="none"/>
+                          <a:srcRect/>
+                          <a:stretch>
+                            <a:fillRect/>
+                          </a:stretch>
+                        </pic:blipFill>
+                        <pic:spPr bwMode="auto">
+                          <a:xfrm>
+                            <a:off x="0" y="0"/>
+                            <a:ext cx="847725" cy="476250"/>
+                          </a:xfrm>
+                          <a:prstGeom prst="rect">
+                            <a:avLst/>
+                          </a:prstGeom>
+                        </pic:spPr>
+                      </pic:pic>
+                    </a:graphicData>
+                  </a:graphic>
+                </wp:inline>
+              </w:drawing>
+            </w:r>
+          </w:p>
+        </w:tc>
+        <w:tc>
+          <w:tcPr>
+            <w:tcBorders>
+              <w:top w:val="none" w:color="FFFFFF" w:sz="0"/>
+              <w:left w:val="none" w:color="FFFFFF" w:sz="0"/>
+              <w:bottom w:val="none" w:color="FFFFFF" w:sz="0"/>
+              <w:right w:val="none" w:color="FFFFFF" w:sz="0"/>
+            </w:tcBorders>
+            <w:tcMar>
+              <w:top w:type="dxa" w:w="120"/>
+              <w:left w:type="dxa" w:w="0"/>
+              <w:bottom w:type="dxa" w:w="160"/>
+              <w:right w:type="dxa" w:w="0"/>
+            </w:tcMar>
+            <w:vAlign w:val="center"/>
+          </w:tcPr>
+          <w:p>
+            <w:pPr>
+              <w:jc w:val="right"/>
+            </w:pPr>
+            <w:r>
+              <w:rPr>
+                <w:rFonts w:ascii="Manrope" w:cs="Manrope" w:eastAsia="Manrope" w:hAnsi="Manrope"/>
+                <w:b/>
+                <w:bCs/>
+                <w:color w:val="132232"/>
+                <w:sz w:val="17"/>
+                <w:szCs w:val="17"/>
+              </w:rPr>
+              <w:t xml:space="preserve">Moveify Health Solutions</w:t>
+            </w:r>
+          </w:p>
+          <w:p>
+            <w:pPr>
+              <w:spacing w:before="20"/>
+              <w:jc w:val="right"/>
+            </w:pPr>
+            <w:r>
+              <w:rPr>
+                <w:rFonts w:ascii="Manrope" w:cs="Manrope" w:eastAsia="Manrope" w:hAnsi="Manrope"/>
+                <w:color w:val="56606E"/>
+                <w:sz w:val="17"/>
+                <w:szCs w:val="17"/>
+              </w:rPr>
+              <w:t xml:space="preserve">4 George St, Williamstown SA 5351</w:t>
+            </w:r>
+            <w:r>
+              <w:rPr>
+                <w:rFonts w:ascii="Manrope" w:cs="Manrope" w:eastAsia="Manrope" w:hAnsi="Manrope"/>
+                <w:b/>
+                <w:bCs/>
+                <w:color w:val="46C1C0"/>
+                <w:sz w:val="17"/>
+                <w:szCs w:val="17"/>
+              </w:rPr>
+              <w:t xml:space="preserve">  ·  </w:t>
+            </w:r>
+            <w:r>
+              <w:rPr>
+                <w:rFonts w:ascii="Manrope" w:cs="Manrope" w:eastAsia="Manrope" w:hAnsi="Manrope"/>
+                <w:color w:val="56606E"/>
+                <w:sz w:val="17"/>
+                <w:szCs w:val="17"/>
+              </w:rPr>
+              <w:t xml:space="preserve">0435 524 991</w:t>
+            </w:r>
+            <w:r>
+              <w:rPr>
+                <w:rFonts w:ascii="Manrope" w:cs="Manrope" w:eastAsia="Manrope" w:hAnsi="Manrope"/>
+                <w:b/>
+                <w:bCs/>
+                <w:color w:val="46C1C0"/>
+                <w:sz w:val="17"/>
+                <w:szCs w:val="17"/>
+              </w:rPr>
+              <w:t xml:space="preserve">  ·  </w:t>
+            </w:r>
+            <w:r>
+              <w:rPr>
+                <w:rFonts w:ascii="Manrope" w:cs="Manrope" w:eastAsia="Manrope" w:hAnsi="Manrope"/>
+                <w:color w:val="56606E"/>
+                <w:sz w:val="17"/>
+                <w:szCs w:val="17"/>
+              </w:rPr>
+              <w:t xml:space="preserve">ryan@moveifyhealth.com</w:t>
+            </w:r>
+          </w:p>
+        </w:tc>
+      </w:tr>
+    </w:tbl>
+    <w:p>
+      <w:pPr>
+        <w:spacing w:after="40" w:before="160"/>
+      </w:pPr>
+      <w:r>
+        <w:rPr>
+          <w:rFonts w:ascii="Manrope" w:cs="Manrope" w:eastAsia="Manrope" w:hAnsi="Manrope"/>
+          <w:b/>
+          <w:bCs/>
+          <w:color w:val="132232"/>
+          <w:sz w:val="34"/>
+          <w:szCs w:val="34"/>
+        </w:rPr>
+        <w:t xml:space="preserve">Exercise Physiology </w:t>
+      </w:r>
+      <w:r>
+        <w:rPr>
+          <w:rFonts w:ascii="Manrope" w:cs="Manrope" w:eastAsia="Manrope" w:hAnsi="Manrope"/>
+          <w:b/>
+          <w:bCs/>
+          <w:color w:val="46C1C0"/>
+          <w:sz w:val="34"/>
+          <w:szCs w:val="34"/>
+        </w:rPr>
+        <w:t xml:space="preserve">Reassessment Report</w:t>
+      </w:r>
+    </w:p>
+    <w:p>
+      <w:pPr>
+        <w:pBdr>
+          <w:bottom w:val="single" w:color="E2E8F0" w:sz="4"/>
+        </w:pBdr>
+        <w:spacing w:after="200"/>
+      </w:pPr>
+      <w:r>
+        <w:rPr>
+          <w:rFonts w:ascii="Manrope" w:cs="Manrope" w:eastAsia="Manrope" w:hAnsi="Manrope"/>
+          <w:b/>
+          <w:bCs/>
+          <w:color w:val="132232"/>
+          <w:sz w:val="22"/>
+          <w:szCs w:val="22"/>
+        </w:rPr>
+        <w:t xml:space="preserve">{{patient_full_name}}</w:t>
+      </w:r>
+      <w:r>
+        <w:rPr>
+          <w:rFonts w:ascii="Manrope" w:cs="Manrope" w:eastAsia="Manrope" w:hAnsi="Manrope"/>
+          <w:color w:val="56606E"/>
+          <w:sz w:val="20"/>
+          <w:szCs w:val="20"/>
+        </w:rPr>
+        <w:t xml:space="preserve">   ·   Baseline </w:t>
+      </w:r>
+      <w:r>
+        <w:rPr>
+          <w:rFonts w:ascii="Manrope" w:cs="Manrope" w:eastAsia="Manrope" w:hAnsi="Manrope"/>
+          <w:b/>
+          <w:bCs/>
+          <w:color w:val="132232"/>
+          <w:sz w:val="20"/>
+          <w:szCs w:val="20"/>
+        </w:rPr>
+        <w:t xml:space="preserve">{{baseline_date}}</w:t>
+      </w:r>
+      <w:r>
+        <w:rPr>
+          <w:rFonts w:ascii="Manrope" w:cs="Manrope" w:eastAsia="Manrope" w:hAnsi="Manrope"/>
+          <w:b/>
+          <w:bCs/>
+          <w:color w:val="46C1C0"/>
+          <w:sz w:val="20"/>
+          <w:szCs w:val="20"/>
+        </w:rPr>
+        <w:t xml:space="preserve">  →  </w:t>
       </w:r>
       <w:r>
         <w:rPr>
@@ -843,108 +1230,6 @@
           <w:szCs w:val="22"/>
         </w:rPr>
         <w:t xml:space="preserve">{{recommendations}}</w:t>
-      </w:r>
-    </w:p>
-    <w:p>
-      <w:pPr>
-        <w:spacing w:after="40" w:before="280"/>
-      </w:pPr>
-      <w:r>
-        <w:rPr>
-          <w:rFonts w:ascii="Manrope" w:cs="Manrope" w:eastAsia="Manrope" w:hAnsi="Manrope"/>
-          <w:color w:val="1A2230"/>
-          <w:sz w:val="22"/>
-          <w:szCs w:val="22"/>
-        </w:rPr>
-        <w:t xml:space="preserve">Kind regards,</w:t>
-      </w:r>
-    </w:p>
-    <w:p>
-      <w:pPr>
-        <w:spacing w:after="120"/>
-      </w:pPr>
-    </w:p>
-    <w:p>
-      <w:pPr>
-        <w:spacing w:after="10"/>
-      </w:pPr>
-      <w:r>
-        <w:rPr>
-          <w:rFonts w:ascii="Manrope" w:cs="Manrope" w:eastAsia="Manrope" w:hAnsi="Manrope"/>
-          <w:b/>
-          <w:bCs/>
-          <w:color w:val="132232"/>
-          <w:sz w:val="24"/>
-          <w:szCs w:val="24"/>
-        </w:rPr>
-        <w:t xml:space="preserve">Ryan Heath</w:t>
-      </w:r>
-    </w:p>
-    <w:p>
-      <w:pPr>
-        <w:spacing w:after="4"/>
-      </w:pPr>
-      <w:r>
-        <w:rPr>
-          <w:rFonts w:ascii="Manrope" w:cs="Manrope" w:eastAsia="Manrope" w:hAnsi="Manrope"/>
-          <w:color w:val="56606E"/>
-          <w:sz w:val="20"/>
-          <w:szCs w:val="20"/>
-        </w:rPr>
-        <w:t xml:space="preserve">BClinExPhys (Hons)  ·  Accredited Exercise Physiologist</w:t>
-      </w:r>
-    </w:p>
-    <w:p>
-      <w:r>
-        <w:rPr>
-          <w:rFonts w:ascii="Manrope" w:cs="Manrope" w:eastAsia="Manrope" w:hAnsi="Manrope"/>
-          <w:b/>
-          <w:bCs/>
-          <w:color w:val="132232"/>
-          <w:sz w:val="20"/>
-          <w:szCs w:val="20"/>
-        </w:rPr>
-        <w:t xml:space="preserve">Moveify Health Solutions</w:t>
-      </w:r>
-      <w:r>
-        <w:rPr>
-          <w:rFonts w:ascii="Manrope" w:cs="Manrope" w:eastAsia="Manrope" w:hAnsi="Manrope"/>
-          <w:b/>
-          <w:bCs/>
-          <w:color w:val="46C1C0"/>
-          <w:sz w:val="20"/>
-          <w:szCs w:val="20"/>
-        </w:rPr>
-        <w:t xml:space="preserve">  ·  </w:t>
-      </w:r>
-      <w:r>
-        <w:rPr>
-          <w:rFonts w:ascii="Manrope" w:cs="Manrope" w:eastAsia="Manrope" w:hAnsi="Manrope"/>
-          <w:color w:val="56606E"/>
-          <w:sz w:val="20"/>
-          <w:szCs w:val="20"/>
-        </w:rPr>
-        <w:t xml:space="preserve">0435 524 991</w:t>
-      </w:r>
-      <w:r>
-        <w:rPr>
-          <w:rFonts w:ascii="Manrope" w:cs="Manrope" w:eastAsia="Manrope" w:hAnsi="Manrope"/>
-          <w:b/>
-          <w:bCs/>
-          <w:color w:val="46C1C0"/>
-          <w:sz w:val="20"/>
-          <w:szCs w:val="20"/>
-        </w:rPr>
-        <w:t xml:space="preserve">  ·  </w:t>
-      </w:r>
-      <w:r>
-        <w:rPr>
-          <w:rFonts w:ascii="Manrope" w:cs="Manrope" w:eastAsia="Manrope" w:hAnsi="Manrope"/>
-          <w:color w:val="56606E"/>
-          <w:sz w:val="20"/>
-          <w:szCs w:val="20"/>
-        </w:rPr>
-        <w:t xml:space="preserve">ryan@moveifyhealth.com</w:t>
       </w:r>
     </w:p>
     <w:p>

</xml_diff>

<commit_message>
scribe/gp-reassessment: cleaner page-2 header + restore sign-off
After the cover-letter split, page 2's heavy 34pt title looked off and the
sign-off had moved to the cover only.

- Page 2 header is now a clean teal-underlined line (navy title + patient name +
  DOB) mirroring the cover's RE: styling, with the baseline→latest dates beneath.
- The full Kind regards / Ryan Heath sign-off is restored at the foot of the
  report (the cover letter keeps its own).

Co-Authored-By: Claude Opus 4.8 <noreply@anthropic.com>
</commit_message>
<xml_diff>
--- a/backend/assets/GP_Reassessment_Template.docx
+++ b/backend/assets/GP_Reassessment_Template.docx
@@ -639,7 +639,10 @@
     </w:tbl>
     <w:p>
       <w:pPr>
-        <w:spacing w:after="40" w:before="160"/>
+        <w:pBdr>
+          <w:bottom w:val="single" w:color="46C1C0" w:sz="12"/>
+        </w:pBdr>
+        <w:spacing w:after="60" w:before="200"/>
       </w:pPr>
       <w:r>
         <w:rPr>
@@ -647,10 +650,10 @@
           <w:b/>
           <w:bCs/>
           <w:color w:val="132232"/>
-          <w:sz w:val="34"/>
-          <w:szCs w:val="34"/>
-        </w:rPr>
-        <w:t xml:space="preserve">Exercise Physiology </w:t>
+          <w:sz w:val="24"/>
+          <w:szCs w:val="24"/>
+        </w:rPr>
+        <w:t xml:space="preserve">Exercise Physiology Reassessment</w:t>
       </w:r>
       <w:r>
         <w:rPr>
@@ -658,19 +661,11 @@
           <w:b/>
           <w:bCs/>
           <w:color w:val="46C1C0"/>
-          <w:sz w:val="34"/>
-          <w:szCs w:val="34"/>
-        </w:rPr>
-        <w:t xml:space="preserve">Reassessment Report</w:t>
-      </w:r>
-    </w:p>
-    <w:p>
-      <w:pPr>
-        <w:pBdr>
-          <w:bottom w:val="single" w:color="E2E8F0" w:sz="4"/>
-        </w:pBdr>
-        <w:spacing w:after="200"/>
-      </w:pPr>
+          <w:sz w:val="22"/>
+          <w:szCs w:val="22"/>
+        </w:rPr>
+        <w:t xml:space="preserve">   —   </w:t>
+      </w:r>
       <w:r>
         <w:rPr>
           <w:rFonts w:ascii="Manrope" w:cs="Manrope" w:eastAsia="Manrope" w:hAnsi="Manrope"/>
@@ -686,10 +681,24 @@
         <w:rPr>
           <w:rFonts w:ascii="Manrope" w:cs="Manrope" w:eastAsia="Manrope" w:hAnsi="Manrope"/>
           <w:color w:val="56606E"/>
-          <w:sz w:val="20"/>
-          <w:szCs w:val="20"/>
-        </w:rPr>
-        <w:t xml:space="preserve">   ·   Baseline </w:t>
+          <w:sz w:val="19"/>
+          <w:szCs w:val="19"/>
+        </w:rPr>
+        <w:t xml:space="preserve">  (DOB {{patient_dob}})</w:t>
+      </w:r>
+    </w:p>
+    <w:p>
+      <w:pPr>
+        <w:spacing w:after="200"/>
+      </w:pPr>
+      <w:r>
+        <w:rPr>
+          <w:rFonts w:ascii="Manrope" w:cs="Manrope" w:eastAsia="Manrope" w:hAnsi="Manrope"/>
+          <w:color w:val="56606E"/>
+          <w:sz w:val="19"/>
+          <w:szCs w:val="19"/>
+        </w:rPr>
+        <w:t xml:space="preserve">Baseline </w:t>
       </w:r>
       <w:r>
         <w:rPr>
@@ -697,8 +706,8 @@
           <w:b/>
           <w:bCs/>
           <w:color w:val="132232"/>
-          <w:sz w:val="20"/>
-          <w:szCs w:val="20"/>
+          <w:sz w:val="19"/>
+          <w:szCs w:val="19"/>
         </w:rPr>
         <w:t xml:space="preserve">{{baseline_date}}</w:t>
       </w:r>
@@ -708,17 +717,17 @@
           <w:b/>
           <w:bCs/>
           <w:color w:val="46C1C0"/>
-          <w:sz w:val="20"/>
-          <w:szCs w:val="20"/>
-        </w:rPr>
-        <w:t xml:space="preserve">  →  </w:t>
+          <w:sz w:val="19"/>
+          <w:szCs w:val="19"/>
+        </w:rPr>
+        <w:t xml:space="preserve">   →   </w:t>
       </w:r>
       <w:r>
         <w:rPr>
           <w:rFonts w:ascii="Manrope" w:cs="Manrope" w:eastAsia="Manrope" w:hAnsi="Manrope"/>
           <w:color w:val="56606E"/>
-          <w:sz w:val="20"/>
-          <w:szCs w:val="20"/>
+          <w:sz w:val="19"/>
+          <w:szCs w:val="19"/>
         </w:rPr>
         <w:t xml:space="preserve">Reassessed </w:t>
       </w:r>
@@ -728,8 +737,8 @@
           <w:b/>
           <w:bCs/>
           <w:color w:val="132232"/>
-          <w:sz w:val="20"/>
-          <w:szCs w:val="20"/>
+          <w:sz w:val="19"/>
+          <w:szCs w:val="19"/>
         </w:rPr>
         <w:t xml:space="preserve">{{latest_date}}</w:t>
       </w:r>
@@ -1230,6 +1239,108 @@
           <w:szCs w:val="22"/>
         </w:rPr>
         <w:t xml:space="preserve">{{recommendations}}</w:t>
+      </w:r>
+    </w:p>
+    <w:p>
+      <w:pPr>
+        <w:spacing w:after="40" w:before="280"/>
+      </w:pPr>
+      <w:r>
+        <w:rPr>
+          <w:rFonts w:ascii="Manrope" w:cs="Manrope" w:eastAsia="Manrope" w:hAnsi="Manrope"/>
+          <w:color w:val="1A2230"/>
+          <w:sz w:val="22"/>
+          <w:szCs w:val="22"/>
+        </w:rPr>
+        <w:t xml:space="preserve">Kind regards,</w:t>
+      </w:r>
+    </w:p>
+    <w:p>
+      <w:pPr>
+        <w:spacing w:after="120"/>
+      </w:pPr>
+    </w:p>
+    <w:p>
+      <w:pPr>
+        <w:spacing w:after="10"/>
+      </w:pPr>
+      <w:r>
+        <w:rPr>
+          <w:rFonts w:ascii="Manrope" w:cs="Manrope" w:eastAsia="Manrope" w:hAnsi="Manrope"/>
+          <w:b/>
+          <w:bCs/>
+          <w:color w:val="132232"/>
+          <w:sz w:val="24"/>
+          <w:szCs w:val="24"/>
+        </w:rPr>
+        <w:t xml:space="preserve">Ryan Heath</w:t>
+      </w:r>
+    </w:p>
+    <w:p>
+      <w:pPr>
+        <w:spacing w:after="4"/>
+      </w:pPr>
+      <w:r>
+        <w:rPr>
+          <w:rFonts w:ascii="Manrope" w:cs="Manrope" w:eastAsia="Manrope" w:hAnsi="Manrope"/>
+          <w:color w:val="56606E"/>
+          <w:sz w:val="20"/>
+          <w:szCs w:val="20"/>
+        </w:rPr>
+        <w:t xml:space="preserve">BClinExPhys (Hons)  ·  Accredited Exercise Physiologist</w:t>
+      </w:r>
+    </w:p>
+    <w:p>
+      <w:r>
+        <w:rPr>
+          <w:rFonts w:ascii="Manrope" w:cs="Manrope" w:eastAsia="Manrope" w:hAnsi="Manrope"/>
+          <w:b/>
+          <w:bCs/>
+          <w:color w:val="132232"/>
+          <w:sz w:val="20"/>
+          <w:szCs w:val="20"/>
+        </w:rPr>
+        <w:t xml:space="preserve">Moveify Health Solutions</w:t>
+      </w:r>
+      <w:r>
+        <w:rPr>
+          <w:rFonts w:ascii="Manrope" w:cs="Manrope" w:eastAsia="Manrope" w:hAnsi="Manrope"/>
+          <w:b/>
+          <w:bCs/>
+          <w:color w:val="46C1C0"/>
+          <w:sz w:val="20"/>
+          <w:szCs w:val="20"/>
+        </w:rPr>
+        <w:t xml:space="preserve">  ·  </w:t>
+      </w:r>
+      <w:r>
+        <w:rPr>
+          <w:rFonts w:ascii="Manrope" w:cs="Manrope" w:eastAsia="Manrope" w:hAnsi="Manrope"/>
+          <w:color w:val="56606E"/>
+          <w:sz w:val="20"/>
+          <w:szCs w:val="20"/>
+        </w:rPr>
+        <w:t xml:space="preserve">0435 524 991</w:t>
+      </w:r>
+      <w:r>
+        <w:rPr>
+          <w:rFonts w:ascii="Manrope" w:cs="Manrope" w:eastAsia="Manrope" w:hAnsi="Manrope"/>
+          <w:b/>
+          <w:bCs/>
+          <w:color w:val="46C1C0"/>
+          <w:sz w:val="20"/>
+          <w:szCs w:val="20"/>
+        </w:rPr>
+        <w:t xml:space="preserve">  ·  </w:t>
+      </w:r>
+      <w:r>
+        <w:rPr>
+          <w:rFonts w:ascii="Manrope" w:cs="Manrope" w:eastAsia="Manrope" w:hAnsi="Manrope"/>
+          <w:color w:val="56606E"/>
+          <w:sz w:val="20"/>
+          <w:szCs w:val="20"/>
+        </w:rPr>
+        <w:t xml:space="preserve">ryan@moveifyhealth.com</w:t>
       </w:r>
     </w:p>
     <w:p>

</xml_diff>

<commit_message>
Apply formatting tweaks to GP reassessment template
Hand-edited formatting changes to the GP reassessment .docx template
(loaded at runtime by services/scribe-gp-reassessment-docx.js). Committed
so prod matches git rather than shipping an uncommitted asset.

Co-Authored-By: Claude Opus 4.8 <noreply@anthropic.com>
</commit_message>
<xml_diff>
--- a/backend/assets/GP_Reassessment_Template.docx
+++ b/backend/assets/GP_Reassessment_Template.docx
@@ -268,55 +268,7 @@
           <w:sz w:val="22"/>
           <w:szCs w:val="22"/>
         </w:rPr>
-        <w:t xml:space="preserve">Thank you sincerely for referring {{ patient_full_name }} to Moveify Health Solutions for Exercise Physiology services under the MBS GP Chronic Condition Management Plan. Please find below the </w:t>
-      </w:r>
-      <w:r>
-        <w:rPr>
-          <w:color w:val="132232"/>
-          <w:sz w:val="22"/>
-          <w:szCs w:val="22"/>
-        </w:rPr>
-        <w:t xml:space="preserve">reassessment </w:t>
-      </w:r>
-      <w:r>
-        <w:rPr>
-          <w:color w:val="132232"/>
-          <w:sz w:val="22"/>
-          <w:szCs w:val="22"/>
-        </w:rPr>
-        <w:t xml:space="preserve">report and </w:t>
-      </w:r>
-      <w:r>
-        <w:rPr>
-          <w:color w:val="132232"/>
-          <w:sz w:val="22"/>
-          <w:szCs w:val="22"/>
-        </w:rPr>
-        <w:t xml:space="preserve">ongoing </w:t>
-      </w:r>
-      <w:r>
-        <w:rPr>
-          <w:color w:val="132232"/>
-          <w:sz w:val="22"/>
-          <w:szCs w:val="22"/>
-        </w:rPr>
-        <w:t xml:space="preserve">recommendations following {{ patient_first_name }}’s </w:t>
-      </w:r>
-      <w:r>
-        <w:rPr>
-          <w:color w:val="132232"/>
-          <w:sz w:val="22"/>
-          <w:szCs w:val="22"/>
-        </w:rPr>
-        <w:t xml:space="preserve">reassessment </w:t>
-      </w:r>
-      <w:r>
-        <w:rPr>
-          <w:color w:val="132232"/>
-          <w:sz w:val="22"/>
-          <w:szCs w:val="22"/>
-        </w:rPr>
-        <w:t>on the {{ appointment_date }}.</w:t>
+        <w:t>Thank you sincerely for referring {{ patient_full_name }} to Moveify Health Solutions for Exercise Physiology services under the MBS GP Chronic Condition Management Plan. Please find below the reassessment report and ongoing recommendations following {{ patient_first_name }}’s reassessment on the {{ appointment_date }}.</w:t>
       </w:r>
     </w:p>
     <w:p>
@@ -348,7 +300,6 @@
       </w:pPr>
       <w:r>
         <w:rPr>
-          <w:rFonts w:ascii="Arial" w:hAnsi="Arial"/>
           <w:b w:val="false"/>
           <w:i w:val="false"/>
           <w:caps w:val="false"/>
@@ -357,63 +308,10 @@
           <w:sz w:val="22"/>
           <w:szCs w:val="22"/>
         </w:rPr>
-        <w:t xml:space="preserve">This report compares </w:t>
-      </w:r>
-      <w:r>
-        <w:rPr>
-          <w:rFonts w:ascii="Arial" w:hAnsi="Arial"/>
-          <w:b w:val="false"/>
-          <w:i w:val="false"/>
-          <w:caps w:val="false"/>
-          <w:smallCaps w:val="false"/>
-          <w:color w:val="auto"/>
-          <w:sz w:val="22"/>
-          <w:szCs w:val="22"/>
-        </w:rPr>
-        <w:t>{{ patient_full_name }}</w:t>
-      </w:r>
-      <w:r>
-        <w:rPr>
-          <w:rFonts w:ascii="Arial" w:hAnsi="Arial"/>
-          <w:b w:val="false"/>
-          <w:i w:val="false"/>
-          <w:caps w:val="false"/>
-          <w:smallCaps w:val="false"/>
-          <w:color w:val="auto"/>
-          <w:sz w:val="22"/>
-          <w:szCs w:val="22"/>
-        </w:rPr>
-        <w:t xml:space="preserve">'s current objective measures against their </w:t>
-      </w:r>
-      <w:r>
-        <w:rPr>
-          <w:rFonts w:ascii="Arial" w:hAnsi="Arial"/>
-          <w:b w:val="false"/>
-          <w:i w:val="false"/>
-          <w:caps w:val="false"/>
-          <w:smallCaps w:val="false"/>
-          <w:color w:val="auto"/>
-          <w:sz w:val="22"/>
-          <w:szCs w:val="22"/>
-        </w:rPr>
-        <w:t>previously recorded objective measures</w:t>
-      </w:r>
-      <w:r>
-        <w:rPr>
-          <w:rFonts w:ascii="Arial" w:hAnsi="Arial"/>
-          <w:b w:val="false"/>
-          <w:i w:val="false"/>
-          <w:caps w:val="false"/>
-          <w:smallCaps w:val="false"/>
-          <w:color w:val="auto"/>
-          <w:sz w:val="22"/>
-          <w:szCs w:val="22"/>
-        </w:rPr>
-        <w:t>, summarises their progress, the clinical interpretation of those changes, and recommendations for the next phase of care.</w:t>
-      </w:r>
-      <w:r>
-        <w:rPr>
-          <w:rFonts w:ascii="Arial" w:hAnsi="Arial"/>
+        <w:t>This report compares {{ patient_full_name }}'s current objective measures against their previously recorded objective measures, summarises their progress, the clinical interpretation of those changes, and recommendations for the next phase of care.</w:t>
+      </w:r>
+      <w:r>
+        <w:rPr>
           <w:color w:val="auto"/>
           <w:sz w:val="22"/>
           <w:szCs w:val="22"/>
@@ -978,6 +876,7 @@
                 <w:sz w:val="22"/>
                 <w:szCs w:val="22"/>
               </w:rPr>
+              <w:t>{{ medicare_no }}</w:t>
             </w:r>
           </w:p>
         </w:tc>
@@ -1046,21 +945,7 @@
                 <w:sz w:val="22"/>
                 <w:szCs w:val="22"/>
               </w:rPr>
-              <w:t xml:space="preserve">{{ </w:t>
-            </w:r>
-            <w:r>
-              <w:rPr>
-                <w:sz w:val="22"/>
-                <w:szCs w:val="22"/>
-              </w:rPr>
-              <w:t>initial_assessment_date</w:t>
-            </w:r>
-            <w:r>
-              <w:rPr>
-                <w:sz w:val="22"/>
-                <w:szCs w:val="22"/>
-              </w:rPr>
-              <w:t xml:space="preserve"> }}</w:t>
+              <w:t>{{ initial_assessment_date }}</w:t>
             </w:r>
           </w:p>
         </w:tc>
@@ -1127,21 +1012,7 @@
                 <w:sz w:val="22"/>
                 <w:szCs w:val="22"/>
               </w:rPr>
-              <w:t xml:space="preserve">{{ </w:t>
-            </w:r>
-            <w:r>
-              <w:rPr>
-                <w:sz w:val="22"/>
-                <w:szCs w:val="22"/>
-              </w:rPr>
-              <w:t>reassessment_date</w:t>
-            </w:r>
-            <w:r>
-              <w:rPr>
-                <w:sz w:val="22"/>
-                <w:szCs w:val="22"/>
-              </w:rPr>
-              <w:t xml:space="preserve"> }}</w:t>
+              <w:t>{{ reassessment_date }}</w:t>
             </w:r>
           </w:p>
         </w:tc>
@@ -1195,13 +1066,6 @@
           <w:szCs w:val="22"/>
         </w:rPr>
       </w:pPr>
-      <w:r>
-        <w:rPr>
-          <w:sz w:val="22"/>
-          <w:szCs w:val="22"/>
-        </w:rPr>
-        <w:t xml:space="preserve">  </w:t>
-      </w:r>
       <w:r>
         <w:rPr>
           <w:sz w:val="22"/>
@@ -1264,17 +1128,17 @@
         <w:tblLook w:val="04a0" w:firstRow="1" w:noVBand="1" w:lastRow="0" w:firstColumn="1" w:lastColumn="0" w:noHBand="0"/>
       </w:tblPr>
       <w:tblGrid>
-        <w:gridCol w:w="1773"/>
+        <w:gridCol w:w="1772"/>
+        <w:gridCol w:w="1325"/>
+        <w:gridCol w:w="1322"/>
         <w:gridCol w:w="1324"/>
-        <w:gridCol w:w="1323"/>
-        <w:gridCol w:w="1323"/>
         <w:gridCol w:w="4003"/>
       </w:tblGrid>
       <w:tr>
         <w:trPr/>
         <w:tc>
           <w:tcPr>
-            <w:tcW w:w="1773" w:type="dxa"/>
+            <w:tcW w:w="1772" w:type="dxa"/>
             <w:tcBorders>
               <w:top w:val="single" w:sz="4" w:space="0" w:color="000000"/>
               <w:start w:val="single" w:sz="4" w:space="0" w:color="000000"/>
@@ -1305,7 +1169,7 @@
         </w:tc>
         <w:tc>
           <w:tcPr>
-            <w:tcW w:w="1324" w:type="dxa"/>
+            <w:tcW w:w="1325" w:type="dxa"/>
             <w:tcBorders>
               <w:top w:val="single" w:sz="4" w:space="0" w:color="000000"/>
               <w:start w:val="single" w:sz="4" w:space="0" w:color="000000"/>
@@ -1335,7 +1199,7 @@
         </w:tc>
         <w:tc>
           <w:tcPr>
-            <w:tcW w:w="1323" w:type="dxa"/>
+            <w:tcW w:w="1322" w:type="dxa"/>
             <w:tcBorders>
               <w:top w:val="single" w:sz="4" w:space="0" w:color="000000"/>
               <w:start w:val="single" w:sz="4" w:space="0" w:color="000000"/>
@@ -1367,7 +1231,7 @@
         </w:tc>
         <w:tc>
           <w:tcPr>
-            <w:tcW w:w="1323" w:type="dxa"/>
+            <w:tcW w:w="1324" w:type="dxa"/>
             <w:tcBorders>
               <w:top w:val="single" w:sz="4" w:space="0" w:color="000000"/>
               <w:start w:val="single" w:sz="4" w:space="0" w:color="000000"/>
@@ -1435,7 +1299,7 @@
         <w:trPr/>
         <w:tc>
           <w:tcPr>
-            <w:tcW w:w="1773" w:type="dxa"/>
+            <w:tcW w:w="1772" w:type="dxa"/>
             <w:tcBorders>
               <w:top w:val="single" w:sz="4" w:space="0" w:color="000000"/>
               <w:start w:val="single" w:sz="4" w:space="0" w:color="000000"/>
@@ -1453,7 +1317,6 @@
             </w:pPr>
             <w:r>
               <w:rPr>
-                <w:rFonts w:ascii="Arial" w:hAnsi="Arial"/>
                 <w:b/>
                 <w:bCs/>
                 <w:i w:val="false"/>
@@ -1465,7 +1328,6 @@
             </w:r>
             <w:r>
               <w:rPr>
-                <w:rFonts w:ascii="Arial" w:hAnsi="Arial"/>
                 <w:b/>
                 <w:bCs/>
                 <w:color w:val="132232"/>
@@ -1478,7 +1340,7 @@
         </w:tc>
         <w:tc>
           <w:tcPr>
-            <w:tcW w:w="1324" w:type="dxa"/>
+            <w:tcW w:w="1325" w:type="dxa"/>
             <w:tcBorders>
               <w:top w:val="single" w:sz="4" w:space="0" w:color="000000"/>
               <w:start w:val="single" w:sz="4" w:space="0" w:color="000000"/>
@@ -1500,7 +1362,6 @@
             </w:pPr>
             <w:r>
               <w:rPr>
-                <w:rFonts w:ascii="Arial" w:hAnsi="Arial"/>
                 <w:b w:val="false"/>
                 <w:bCs w:val="false"/>
                 <w:i w:val="false"/>
@@ -1514,7 +1375,7 @@
         </w:tc>
         <w:tc>
           <w:tcPr>
-            <w:tcW w:w="1323" w:type="dxa"/>
+            <w:tcW w:w="1322" w:type="dxa"/>
             <w:tcBorders>
               <w:top w:val="single" w:sz="4" w:space="0" w:color="000000"/>
               <w:start w:val="single" w:sz="4" w:space="0" w:color="000000"/>
@@ -1536,7 +1397,6 @@
             </w:pPr>
             <w:r>
               <w:rPr>
-                <w:rFonts w:ascii="Arial" w:hAnsi="Arial"/>
                 <w:b w:val="false"/>
                 <w:bCs w:val="false"/>
                 <w:i w:val="false"/>
@@ -1550,7 +1410,7 @@
         </w:tc>
         <w:tc>
           <w:tcPr>
-            <w:tcW w:w="1323" w:type="dxa"/>
+            <w:tcW w:w="1324" w:type="dxa"/>
             <w:tcBorders>
               <w:top w:val="single" w:sz="4" w:space="0" w:color="000000"/>
               <w:start w:val="single" w:sz="4" w:space="0" w:color="000000"/>
@@ -1573,7 +1433,6 @@
             </w:pPr>
             <w:r>
               <w:rPr>
-                <w:rFonts w:ascii="Arial" w:hAnsi="Arial"/>
                 <w:b w:val="false"/>
                 <w:bCs w:val="false"/>
                 <w:i w:val="false"/>
@@ -1611,7 +1470,6 @@
             </w:pPr>
             <w:r>
               <w:rPr>
-                <w:rFonts w:ascii="Arial" w:hAnsi="Arial"/>
                 <w:i w:val="false"/>
                 <w:iCs w:val="false"/>
                 <w:color w:val="auto"/>
@@ -1650,31 +1508,19 @@
     <w:p>
       <w:pPr>
         <w:pStyle w:val="Normal"/>
+        <w:widowControl/>
+        <w:suppressAutoHyphens w:val="true"/>
+        <w:bidi w:val="0"/>
         <w:spacing w:lineRule="exact" w:line="340" w:before="0" w:after="120"/>
-        <w:ind w:hanging="0" w:start="0" w:end="1134"/>
-        <w:rPr>
-          <w:rFonts w:ascii="Arial" w:hAnsi="Arial"/>
-          <w:sz w:val="22"/>
-          <w:szCs w:val="22"/>
-        </w:rPr>
-      </w:pPr>
-      <w:r>
-        <w:rPr>
-          <w:rFonts w:ascii="Arial" w:hAnsi="Arial"/>
-          <w:b w:val="false"/>
-          <w:i w:val="false"/>
-          <w:color w:val="3A4452"/>
-          <w:sz w:val="22"/>
-          <w:szCs w:val="22"/>
-        </w:rPr>
-        <w:t xml:space="preserve">  </w:t>
-      </w:r>
-      <w:r>
-        <w:rPr>
-          <w:rFonts w:ascii="Arial" w:hAnsi="Arial"/>
-          <w:b w:val="false"/>
-          <w:i w:val="false"/>
-          <w:color w:val="3A4452"/>
+        <w:ind w:hanging="0" w:start="0" w:end="0"/>
+        <w:jc w:val="start"/>
+        <w:rPr>
+          <w:sz w:val="22"/>
+          <w:szCs w:val="22"/>
+        </w:rPr>
+      </w:pPr>
+      <w:r>
+        <w:rPr>
           <w:sz w:val="22"/>
           <w:szCs w:val="22"/>
         </w:rPr>
@@ -1684,28 +1530,12 @@
     <w:p>
       <w:pPr>
         <w:pStyle w:val="Normal"/>
-        <w:spacing w:before="0" w:after="60"/>
-        <w:ind w:start="120" w:end="120"/>
-        <w:rPr>
-          <w:color w:val="132232"/>
-          <w:sz w:val="22"/>
-          <w:szCs w:val="22"/>
-        </w:rPr>
-      </w:pPr>
-      <w:r>
-        <w:rPr>
-          <w:color w:val="132232"/>
-          <w:sz w:val="22"/>
-          <w:szCs w:val="22"/>
-        </w:rPr>
-      </w:r>
-    </w:p>
-    <w:p>
-      <w:pPr>
-        <w:pStyle w:val="Normal"/>
+        <w:widowControl/>
         <w:shd w:val="clear" w:color="auto" w:fill="132232"/>
+        <w:suppressAutoHyphens w:val="true"/>
+        <w:bidi w:val="0"/>
         <w:spacing w:before="240" w:after="80"/>
-        <w:ind w:start="120" w:end="120"/>
+        <w:ind w:hanging="0" w:start="113" w:end="113"/>
         <w:jc w:val="center"/>
         <w:rPr>
           <w:sz w:val="22"/>
@@ -1720,7 +1550,7 @@
           <w:sz w:val="22"/>
           <w:szCs w:val="22"/>
         </w:rPr>
-        <w:t>RECCOMENDATIONS</w:t>
+        <w:t>RECOMMENDATIONS</w:t>
       </w:r>
     </w:p>
     <w:p>
@@ -1739,49 +1569,7 @@
           <w:sz w:val="22"/>
           <w:szCs w:val="22"/>
         </w:rPr>
-      </w:r>
-    </w:p>
-    <w:p>
-      <w:pPr>
-        <w:pStyle w:val="Normal"/>
-        <w:spacing w:before="0" w:after="60"/>
-        <w:ind w:hanging="0" w:start="0" w:end="120"/>
-        <w:rPr>
-          <w:sz w:val="22"/>
-          <w:szCs w:val="22"/>
-        </w:rPr>
-      </w:pPr>
-      <w:r>
-        <w:rPr>
-          <w:color w:val="132232"/>
-          <w:sz w:val="22"/>
-          <w:szCs w:val="22"/>
-        </w:rPr>
-        <w:t xml:space="preserve">  </w:t>
-      </w:r>
-      <w:r>
-        <w:rPr>
-          <w:color w:val="132232"/>
-          <w:sz w:val="22"/>
-          <w:szCs w:val="22"/>
-        </w:rPr>
-        <w:t xml:space="preserve">{{ </w:t>
-      </w:r>
-      <w:r>
-        <w:rPr>
-          <w:color w:val="132232"/>
-          <w:sz w:val="22"/>
-          <w:szCs w:val="22"/>
-        </w:rPr>
-        <w:t>recommendations</w:t>
-      </w:r>
-      <w:r>
-        <w:rPr>
-          <w:color w:val="132232"/>
-          <w:sz w:val="22"/>
-          <w:szCs w:val="22"/>
-        </w:rPr>
-        <w:t xml:space="preserve"> }}</w:t>
+        <w:t>{{ recommendations }}</w:t>
       </w:r>
     </w:p>
     <w:sectPr>
@@ -1995,17 +1783,7 @@
               <w:sz w:val="26"/>
               <w:szCs w:val="26"/>
             </w:rPr>
-            <w:t>REASSESSMENT</w:t>
-          </w:r>
-          <w:r>
-            <w:rPr>
-              <w:b/>
-              <w:bCs/>
-              <w:color w:val="132232"/>
-              <w:sz w:val="26"/>
-              <w:szCs w:val="26"/>
-            </w:rPr>
-            <w:t xml:space="preserve"> REPORT</w:t>
+            <w:t>REASSESSMENT REPORT</w:t>
           </w:r>
         </w:p>
         <w:p>
@@ -2142,17 +1920,7 @@
               <w:sz w:val="26"/>
               <w:szCs w:val="26"/>
             </w:rPr>
-            <w:t>REASSESSMENT</w:t>
-          </w:r>
-          <w:r>
-            <w:rPr>
-              <w:b/>
-              <w:bCs/>
-              <w:color w:val="132232"/>
-              <w:sz w:val="26"/>
-              <w:szCs w:val="26"/>
-            </w:rPr>
-            <w:t xml:space="preserve"> REPORT</w:t>
+            <w:t>REASSESSMENT REPORT</w:t>
           </w:r>
         </w:p>
         <w:p>
@@ -2587,6 +2355,7 @@
     <w:qFormat/>
     <w:pPr>
       <w:widowControl/>
+      <w:suppressAutoHyphens w:val="true"/>
       <w:bidi w:val="0"/>
       <w:spacing w:before="0" w:after="0"/>
       <w:jc w:val="start"/>
@@ -2606,6 +2375,7 @@
     <w:qFormat/>
     <w:pPr>
       <w:widowControl/>
+      <w:suppressAutoHyphens w:val="true"/>
       <w:bidi w:val="0"/>
       <w:spacing w:before="0" w:after="0"/>
       <w:jc w:val="start"/>
@@ -2628,6 +2398,7 @@
     <w:qFormat/>
     <w:pPr>
       <w:widowControl/>
+      <w:suppressAutoHyphens w:val="true"/>
       <w:bidi w:val="0"/>
       <w:spacing w:before="0" w:after="0"/>
       <w:jc w:val="start"/>
@@ -2650,6 +2421,7 @@
     <w:qFormat/>
     <w:pPr>
       <w:widowControl/>
+      <w:suppressAutoHyphens w:val="true"/>
       <w:bidi w:val="0"/>
       <w:spacing w:before="0" w:after="0"/>
       <w:jc w:val="start"/>
@@ -2672,6 +2444,7 @@
     <w:qFormat/>
     <w:pPr>
       <w:widowControl/>
+      <w:suppressAutoHyphens w:val="true"/>
       <w:bidi w:val="0"/>
       <w:spacing w:before="0" w:after="0"/>
       <w:jc w:val="start"/>
@@ -2696,6 +2469,7 @@
     <w:qFormat/>
     <w:pPr>
       <w:widowControl/>
+      <w:suppressAutoHyphens w:val="true"/>
       <w:bidi w:val="0"/>
       <w:spacing w:before="0" w:after="0"/>
       <w:jc w:val="start"/>
@@ -2718,6 +2492,7 @@
     <w:qFormat/>
     <w:pPr>
       <w:widowControl/>
+      <w:suppressAutoHyphens w:val="true"/>
       <w:bidi w:val="0"/>
       <w:spacing w:before="0" w:after="0"/>
       <w:jc w:val="start"/>
@@ -2749,11 +2524,18 @@
       <w:u w:val="single"/>
     </w:rPr>
   </w:style>
-  <w:style w:type="character" w:styleId="FootnoteCharacters">
-    <w:name w:val="Footnote Characters"/>
+  <w:style w:type="character" w:styleId="FootnoteCharactersuser">
+    <w:name w:val="Footnote Characters (user)"/>
     <w:uiPriority w:val="99"/>
     <w:semiHidden/>
     <w:unhideWhenUsed/>
+    <w:qFormat/>
+    <w:rPr>
+      <w:vertAlign w:val="superscript"/>
+    </w:rPr>
+  </w:style>
+  <w:style w:type="character" w:styleId="FootnoteCharacters">
+    <w:name w:val="Footnote Characters"/>
     <w:qFormat/>
     <w:rPr>
       <w:vertAlign w:val="superscript"/>
@@ -2777,11 +2559,18 @@
       <w:szCs w:val="20"/>
     </w:rPr>
   </w:style>
-  <w:style w:type="character" w:styleId="EndnoteCharacters">
-    <w:name w:val="Endnote Characters"/>
+  <w:style w:type="character" w:styleId="EndnoteCharactersuser">
+    <w:name w:val="Endnote Characters (user)"/>
     <w:uiPriority w:val="99"/>
     <w:semiHidden/>
     <w:unhideWhenUsed/>
+    <w:qFormat/>
+    <w:rPr>
+      <w:vertAlign w:val="superscript"/>
+    </w:rPr>
+  </w:style>
+  <w:style w:type="character" w:styleId="EndnoteCharacters">
+    <w:name w:val="Endnote Characters"/>
     <w:qFormat/>
     <w:rPr>
       <w:vertAlign w:val="superscript"/>
@@ -2887,6 +2676,7 @@
     <w:qFormat/>
     <w:pPr>
       <w:widowControl/>
+      <w:suppressAutoHyphens w:val="true"/>
       <w:bidi w:val="0"/>
       <w:spacing w:before="0" w:after="0"/>
       <w:jc w:val="start"/>
@@ -2905,6 +2695,7 @@
     <w:qFormat/>
     <w:pPr>
       <w:widowControl/>
+      <w:suppressAutoHyphens w:val="true"/>
       <w:bidi w:val="0"/>
       <w:spacing w:before="0" w:after="0"/>
       <w:jc w:val="start"/>
@@ -2925,6 +2716,7 @@
     <w:qFormat/>
     <w:pPr>
       <w:widowControl/>
+      <w:suppressAutoHyphens w:val="true"/>
       <w:bidi w:val="0"/>
       <w:spacing w:before="0" w:after="0"/>
       <w:jc w:val="start"/>
@@ -2946,6 +2738,7 @@
     <w:unhideWhenUsed/>
     <w:pPr>
       <w:widowControl/>
+      <w:suppressAutoHyphens w:val="true"/>
       <w:bidi w:val="0"/>
       <w:spacing w:before="0" w:after="0"/>
       <w:jc w:val="start"/>
@@ -2967,6 +2760,7 @@
     <w:unhideWhenUsed/>
     <w:pPr>
       <w:widowControl/>
+      <w:suppressAutoHyphens w:val="true"/>
       <w:bidi w:val="0"/>
       <w:spacing w:before="0" w:after="0"/>
       <w:jc w:val="start"/>

</xml_diff>